<commit_message>
Revise architectural roadmaps; add sprite-layer
Revamp architectural roadmap docs: phases 7–8 marked superseded by the freeform rendering system, Phase 1 pivoted to a roof‑moat floating-strip approach, Phase 9 scoped toward octagonal tree trunks, and a new TRAPDOOR_ARCHITECTURE_ROADMAP.md was added. Engine updates to support the freeform/recess/chamfer work include adding engine/sprite-layer.js and changes across raycaster, spatial-contract, texture-atlas, door-sprites/door-animator, bonfire-sprites, floor-manager, and game to wire up freeform tiles, all-face recesses and chamfered corners. Miscellaneous: updated docs/Archive/CSS_TO_USE.md, docs/DOOR_ARCHITECTURE_ROADMAP.md, updated BLOCKOUT_REFRESH_PLAN.docx, and small UI/tooling updates (index.html, tools/peek-workbench.html).
</commit_message>
<xml_diff>
--- a/docs/BLOCKOUT_REFRESH_PLAN.docx
+++ b/docs/BLOCKOUT_REFRESH_PLAN.docx
@@ -4389,6 +4389,30 @@
     </w:p>
     <w:p>
       <w:pPr>
+        <w:spacing w:after="160"/>
+      </w:pPr>
+      <w:r>
+        <w:rPr>
+          <w:rFonts w:ascii="Arial" w:cs="Arial" w:eastAsia="Arial" w:hAnsi="Arial"/>
+          <w:b/>
+          <w:bCs/>
+          <w:color w:val="C00000"/>
+          <w:sz w:val="22"/>
+          <w:szCs w:val="22"/>
+        </w:rPr>
+        <w:t xml:space="preserve">DEPENDENCY: </w:t>
+      </w:r>
+      <w:r>
+        <w:rPr>
+          <w:rFonts w:ascii="Arial" w:cs="Arial" w:eastAsia="Arial" w:hAnsi="Arial"/>
+          <w:sz w:val="22"/>
+          <w:szCs w:val="22"/>
+        </w:rPr>
+        <w:t xml:space="preserve">2-tile-wide boss doors require the double-door rendering support from DOOR_ARCHITECTURE_ROADMAP.md Phase 6A (multi-tile freeform spans, synchronized UV split across adjacent tiles). Phase 6A (Double Doors) and Phase 6B (Great Arches) shipped 2026-04-13 with UV continuity fix. Phase 3 stamp-out of DOOR_FACADE to all buildings is now UNBLOCKED. Phase E (Boss Door Prototype) can proceed — the double-door pattern is established. Remaining Phase 3 conversions: Coral Bazaar (door_panel_glass + door_lightbrick), Driftwood Inn (door_panel_wood + door_wood), Dispatcher’s Office (door_panel_iron + door_metal), Watchman’s Post (door_panel_studded + door_cathedral), plus biome default fallbacks in SpatialContract.</w:t>
+      </w:r>
+    </w:p>
+    <w:p>
+      <w:pPr>
         <w:pStyle w:val="Heading2"/>
       </w:pPr>
       <w:r>
@@ -5728,7 +5752,7 @@
           <w:sz w:val="28"/>
           <w:szCs w:val="28"/>
         </w:rPr>
-        <w:t xml:space="preserve">Phase A: New Textures</w:t>
+        <w:t xml:space="preserve">Phase A: New Textures ✔ SHIPPED</w:t>
       </w:r>
     </w:p>
     <w:p>
@@ -5741,7 +5765,7 @@
           <w:sz w:val="22"/>
           <w:szCs w:val="22"/>
         </w:rPr>
-        <w:t xml:space="preserve">Add the 6 new TextureAtlas texture IDs from Section 2.2. Procedurally generated 64x64 canvases — no external assets. Test each on a wall in-game.</w:t>
+        <w:t xml:space="preserve">Add the 6 new TextureAtlas texture IDs from Section 2.2. Procedurally generated 64x64 canvases — no external assets. Test each on a wall in-game. ALL 6 SHIPPED: door_panel_oiled, door_panel_charcoal, door_panel_ironbound (with ironBands generator feature), door_lightbrick, door_metal, door_cathedral. Plus trapdoor_lid (64x64 hatch texture) and decor_ladder (32x32 alpha-transparent sprite). See texture-atlas.js _generateAll().</w:t>
       </w:r>
     </w:p>
     <w:p>
@@ -6035,7 +6059,7 @@
                 <w:sz w:val="20"/>
                 <w:szCs w:val="20"/>
               </w:rPr>
-              <w:t xml:space="preserve">Phases 0–5A shipped. Phases 5B–D (panel rendering, recess, animation) align with this refresh.</w:t>
+              <w:t xml:space="preserve">Phases 0–6B shipped. Phase 2 visual upgrade shipped (trapdoor see-through cavity, ladder sprites, hatch lid texture). Phase 6A (double doors) + 6B (great arches) shipped 2026-04-13. Phase 3 stamp-out NOW UNBLOCKED. Phases 5B–D specced.</w:t>
             </w:r>
           </w:p>
         </w:tc>
@@ -6428,6 +6452,64 @@
                 <w:szCs w:val="20"/>
               </w:rPr>
               <w:t xml:space="preserve">Three-phase visual transitions. Gate arches use these presets.</w:t>
+            </w:r>
+          </w:p>
+        </w:tc>
+      </w:tr>
+      <w:tr>
+        <w:tc>
+          <w:tcPr>
+            <w:tcW w:type="dxa" w:w="3800"/>
+            <w:tcBorders>
+              <w:top w:val="single" w:color="CCCCCC" w:sz="1"/>
+              <w:left w:val="single" w:color="CCCCCC" w:sz="1"/>
+              <w:bottom w:val="single" w:color="CCCCCC" w:sz="1"/>
+              <w:right w:val="single" w:color="CCCCCC" w:sz="1"/>
+            </w:tcBorders>
+            <w:tcMar>
+              <w:top w:type="dxa" w:w="80"/>
+              <w:left w:type="dxa" w:w="120"/>
+              <w:bottom w:type="dxa" w:w="80"/>
+              <w:right w:type="dxa" w:w="120"/>
+            </w:tcMar>
+          </w:tcPr>
+          <w:p>
+            <w:r>
+              <w:rPr>
+                <w:rFonts w:ascii="Arial" w:cs="Arial" w:eastAsia="Arial" w:hAnsi="Arial"/>
+                <w:b/>
+                <w:bCs/>
+                <w:sz w:val="20"/>
+                <w:szCs w:val="20"/>
+              </w:rPr>
+              <w:t xml:space="preserve">TRAPDOOR_ARCHITECTURE_ROADMAP.md</w:t>
+            </w:r>
+          </w:p>
+        </w:tc>
+        <w:tc>
+          <w:tcPr>
+            <w:tcW w:type="dxa" w:w="5560"/>
+            <w:tcBorders>
+              <w:top w:val="single" w:color="CCCCCC" w:sz="1"/>
+              <w:left w:val="single" w:color="CCCCCC" w:sz="1"/>
+              <w:bottom w:val="single" w:color="CCCCCC" w:sz="1"/>
+              <w:right w:val="single" w:color="CCCCCC" w:sz="1"/>
+            </w:tcBorders>
+            <w:tcMar>
+              <w:top w:type="dxa" w:w="80"/>
+              <w:left w:type="dxa" w:w="120"/>
+              <w:bottom w:type="dxa" w:w="80"/>
+              <w:right w:type="dxa" w:w="120"/>
+            </w:tcMar>
+          </w:tcPr>
+          <w:p>
+            <w:r>
+              <w:rPr>
+                <w:rFonts w:ascii="Arial" w:cs="Arial" w:eastAsia="Arial" w:hAnsi="Arial"/>
+                <w:sz w:val="20"/>
+                <w:szCs w:val="20"/>
+              </w:rPr>
+              <w:t xml:space="preserve">NEW. Tiers 1–5 shipped (freeform rebalance, see-through cavity, ladder sprite, hatch lid, direction-aware tint). Tiers 6–8 specced (pedestal mask, biome variants, animation).</w:t>
             </w:r>
           </w:p>
         </w:tc>

</xml_diff>

<commit_message>
Split raycaster; add perf probes, tile tweaks
Refactor raycaster into multiple submodules (lighting, textures, projection, floor, walls, sprites + smaller core) and update docs/roadmaps to reflect the extraction. Add new engine raycaster files and wire the split into Layer 2. Enhance DebugPerfMonitor with an in-module probe API (begin/end/count/span), probe registration for raycaster submodules, and related instrumentation/caveats to enable fine-grained hotpath attribution. Add a Test Harness Roadmap and scene-baseline plan for deterministic perf regression gating. Make floor-manager tile/texture/height updates (add TREE_SQ id 85, adjust CHEST/BED/TABLE/BAR_COUNTER heights and offsets, assign floor textures), plus assorted tools/UI files and support scripts for the visualizer and designers. Misc doc and index.html updates to document the split and workflow.
</commit_message>
<xml_diff>
--- a/docs/BLOCKOUT_REFRESH_PLAN.docx
+++ b/docs/BLOCKOUT_REFRESH_PLAN.docx
@@ -360,6 +360,24 @@
           <w:szCs w:val="22"/>
         </w:rPr>
         <w:t xml:space="preserve">TextureAtlas procedural textures for all materials — shipped</w:t>
+      </w:r>
+    </w:p>
+    <w:p>
+      <w:pPr>
+        <w:pStyle w:val="ListParagraph"/>
+        <w:numPr>
+          <w:ilvl w:val="0"/>
+          <w:numId w:val="3"/>
+        </w:numPr>
+        <w:spacing w:after="80"/>
+      </w:pPr>
+      <w:r>
+        <w:rPr>
+          <w:rFonts w:ascii="Arial" w:cs="Arial" w:eastAsia="Arial" w:hAnsi="Arial"/>
+          <w:sz w:val="22"/>
+          <w:szCs w:val="22"/>
+        </w:rPr>
+        <w:t xml:space="preserve">STOOP (86) and DECK (87) — raised walkable platform tiles. 0.08× thin lip on a +0.10 Doom-rule offset; walkable, non-opaque. Floor-texture overrides (floor_flagstone for STOOP, floor_boardwalk for DECK) differentiate the platform surface from surrounding ground. Toolbox for front-stoop landings, porch entries, and multi-tile boardwalk decks ringed with FENCE (0.4h) railings — shipped</w:t>
       </w:r>
     </w:p>
     <w:p>

</xml_diff>

<commit_message>
Add blockout docs; ship raycaster shape & elev fixes
Add a suite of blockout-arc docs and roadmaps (DOC_GRAPH_BLOCKOUT_ARC, POST_JAM_FOLLOWUP_ROADMAP, MULTI_ELEVATION_RENDERING, FLOOR_RECIPROCITY_BUGS) and update TOC/agent notes. Implement rendering and spatial changes: ray-vs-circle + circle4 support and tileShapes routing in SpatialContract, player elevation corrections in raycaster and floor projection, and related engine fixes across raycaster.js, raycaster-floor.js, spatial-contract.js, tiles.js and multiple floor blockouts. Also fix two floor door reciprocity bugs, add tooling and templates (CLI commands, visualizer, webOS build scripts, vendor jsPlumb), and update .gitignore to ignore /dist. These changes consolidate docs, ship Phase 9 circular trunks/quad pillars and multi-elevation rendering, and add supporting tooling and test/verification notes.
</commit_message>
<xml_diff>
--- a/docs/BLOCKOUT_REFRESH_PLAN.docx
+++ b/docs/BLOCKOUT_REFRESH_PLAN.docx
@@ -70,6 +70,26 @@
           <w:szCs w:val="32"/>
         </w:rPr>
         <w:t xml:space="preserve">1. Purpose &amp; Scope</w:t>
+      </w:r>
+    </w:p>
+    <w:p>
+      <w:pPr>
+        <w:pBdr>
+          <w:left w:val="single" w:color="888888" w:sz="6" w:space="6"/>
+        </w:pBdr>
+        <w:spacing w:after="200"/>
+        <w:ind w:left="120"/>
+      </w:pPr>
+      <w:r>
+        <w:rPr>
+          <w:rFonts w:ascii="Arial" w:cs="Arial" w:eastAsia="Arial" w:hAnsi="Arial"/>
+          <w:i/>
+          <w:iCs/>
+          <w:color w:val="555555"/>
+          <w:sz w:val="20"/>
+          <w:szCs w:val="20"/>
+        </w:rPr>
+        <w:t xml:space="preserve">REFS — TOC entry: TABLE_OF_CONTENTS_CROSS_ROADMAP.md §Current arc (why this plan exists now). North stars this refresh feeds into: LIVING_INFRASTRUCTURE_BLOCKOUT.md (verb-node placements inside refreshed buildings) and ACT2_NARRATIVE_OUTLINE.md §4 (faction HQ facades) / §5.4 (housing reassignment interior changes). Ramp-up already shipped: DOOR_ARCHITECTURE_ROADMAP.md (Ph 0–2, 5A, 6A/6B), LIVING_WINDOWS_ROADMAP.md (Ph 0–2.5), RAYCAST_FREEFORM_UPGRADE_ROADMAP.md, RECESS_REPAIR_ROADMAP.md (archived — folds into DOOR Ph 1.5).</w:t>
       </w:r>
     </w:p>
     <w:p>
@@ -398,6 +418,26 @@
           <w:szCs w:val="32"/>
         </w:rPr>
         <w:t xml:space="preserve">2. The Door Contrast System</w:t>
+      </w:r>
+    </w:p>
+    <w:p>
+      <w:pPr>
+        <w:pBdr>
+          <w:left w:val="single" w:color="888888" w:sz="6" w:space="6"/>
+        </w:pBdr>
+        <w:spacing w:after="200"/>
+        <w:ind w:left="120"/>
+      </w:pPr>
+      <w:r>
+        <w:rPr>
+          <w:rFonts w:ascii="Arial" w:cs="Arial" w:eastAsia="Arial" w:hAnsi="Arial"/>
+          <w:i/>
+          <w:iCs/>
+          <w:color w:val="555555"/>
+          <w:sz w:val="20"/>
+          <w:szCs w:val="20"/>
+        </w:rPr>
+        <w:t xml:space="preserve">REFS — Data sources: engine/building-registry.js (wallTexture, doorPanel, doorTexture, archTexture, mullionStyle fields). Texture pipeline: engine/texture-atlas.js _generateAll() · TEXTURE_ROADMAP.md §2 (3-layer model; new panels are Layer 1). Door rendering rules: DOOR_ARCHITECTURE_ROADMAP.md §Ph 1 (DOOR_FACADE baseline) + §Ph 1.5 (Wolfenstein recess — canonical after repair). Freeform cavity band sizing: SPATIAL_CONTRACTS.md §tileFreeform + engine/spatial-contract.js (exterior/interior constructors). Biome-appropriate wall materials: Biome Plan.html §Floors 1–3 palette tables.</w:t>
       </w:r>
     </w:p>
     <w:p>
@@ -2520,6 +2560,26 @@
           <w:szCs w:val="32"/>
         </w:rPr>
         <w:t xml:space="preserve">3. Current Building Inventory &amp; Audit</w:t>
+      </w:r>
+    </w:p>
+    <w:p>
+      <w:pPr>
+        <w:pBdr>
+          <w:left w:val="single" w:color="888888" w:sz="6" w:space="6"/>
+        </w:pBdr>
+        <w:spacing w:after="200"/>
+        <w:ind w:left="120"/>
+      </w:pPr>
+      <w:r>
+        <w:rPr>
+          <w:rFonts w:ascii="Arial" w:cs="Arial" w:eastAsia="Arial" w:hAnsi="Arial"/>
+          <w:i/>
+          <w:iCs/>
+          <w:color w:val="555555"/>
+          <w:sz w:val="20"/>
+          <w:szCs w:val="20"/>
+        </w:rPr>
+        <w:t xml:space="preserve">REFS — Building definitions: engine/building-registry.js · engine/floor-manager.js (doorFaces + doorTargets per floor). Floor geometry source of truth: Biome Plan.html §Floor layouts · BLOCKOUT_ALIGNMENT.md (floor-by-floor gap analysis). Narrative anchors for named buildings: STREET_CHRONICLES_NARRATIVE_OUTLINE.md (Act 1 factions: Coral Bazaar, Driftwood Inn, Dispatcher’s Office, Watchman’s Post) · ACT2_NARRATIVE_OUTLINE.md §4.1 (Lt. Mei / Agent Crow / Father Ashworth / Handler Vala contact venues). NPC occupancy: NPC_SYSTEM_ROADMAP.md · NPC_FACTION_BOOK_AUDIT.md.</w:t>
       </w:r>
     </w:p>
     <w:p>
@@ -4033,6 +4093,26 @@
     </w:p>
     <w:p>
       <w:pPr>
+        <w:pBdr>
+          <w:left w:val="single" w:color="888888" w:sz="6" w:space="6"/>
+        </w:pBdr>
+        <w:spacing w:after="200"/>
+        <w:ind w:left="120"/>
+      </w:pPr>
+      <w:r>
+        <w:rPr>
+          <w:rFonts w:ascii="Arial" w:cs="Arial" w:eastAsia="Arial" w:hAnsi="Arial"/>
+          <w:i/>
+          <w:iCs/>
+          <w:color w:val="555555"/>
+          <w:sz w:val="20"/>
+          <w:szCs w:val="20"/>
+        </w:rPr>
+        <w:t xml:space="preserve">REFS — Recess machinery: DOOR_ARCHITECTURE_ROADMAP.md §Ph 1.5 Wolfenstein thin-wall (extend from DOOR_FACADE to PORTHOLE). Alpha-mask freeform pipeline: RAYCAST_FREEFORM_UPGRADE_ROADMAP.md §Multi-segment walls. Arch height + shape family: ARCHITECTURAL_SHAPES_ROADMAP.md §Ph 1–6 · DOOR_ARCHITECTURE_ROADMAP.md §Ph 6B (great arches, shipped). Transition choreography + SFX: DOOR_EFFECTS_ROADMAP.md · engine/floor-transition.js (state machine) · engine/door-contract-audio.js. Per-tile exterior-face registration: engine/door-sprites.js setExteriorFace().</w:t>
+      </w:r>
+    </w:p>
+    <w:p>
+      <w:pPr>
         <w:spacing w:after="160"/>
       </w:pPr>
       <w:r>
@@ -4376,6 +4456,26 @@
     </w:p>
     <w:p>
       <w:pPr>
+        <w:pBdr>
+          <w:left w:val="single" w:color="888888" w:sz="6" w:space="6"/>
+        </w:pBdr>
+        <w:spacing w:after="200"/>
+        <w:ind w:left="120"/>
+      </w:pPr>
+      <w:r>
+        <w:rPr>
+          <w:rFonts w:ascii="Arial" w:cs="Arial" w:eastAsia="Arial" w:hAnsi="Arial"/>
+          <w:i/>
+          <w:iCs/>
+          <w:color w:val="555555"/>
+          <w:sz w:val="20"/>
+          <w:szCs w:val="20"/>
+        </w:rPr>
+        <w:t xml:space="preserve">REFS — Double-door rendering: DOOR_ARCHITECTURE_ROADMAP.md §Ph 6A (shipped 2026-04-13, UV continuity fix verified). Animation contract: engine/door-animator.js (split/portcullis); cavity-aware animation for DOOR_FACADE still pending per DOOR_ARCH §7 Open Q #2. Placement candidates: HERO_FOYER_ENCOUNTER.md (Hero’s Wake B2 = 2.2.2 Act 1 candidate) · ACT2_NARRATIVE_OUTLINE.md §8 Ph 4 (Seaway 0.1.2 climax). Faction boss context: STREET_CHRONICLES_NARRATIVE_OUTLINE.md (faction HQs) · NPC_FACTION_BOOK_AUDIT.md. Lock/unlock state: engine/card-authority.js keyring · engine/interact-prompt.js prompt copy.</w:t>
+      </w:r>
+    </w:p>
+    <w:p>
+      <w:pPr>
         <w:spacing w:after="160"/>
       </w:pPr>
       <w:r>
@@ -4690,6 +4790,26 @@
           <w:szCs w:val="32"/>
         </w:rPr>
         <w:t xml:space="preserve">6. Window System Alignment</w:t>
+      </w:r>
+    </w:p>
+    <w:p>
+      <w:pPr>
+        <w:pBdr>
+          <w:left w:val="single" w:color="888888" w:sz="6" w:space="6"/>
+        </w:pBdr>
+        <w:spacing w:after="200"/>
+        <w:ind w:left="120"/>
+      </w:pPr>
+      <w:r>
+        <w:rPr>
+          <w:rFonts w:ascii="Arial" w:cs="Arial" w:eastAsia="Arial" w:hAnsi="Arial"/>
+          <w:i/>
+          <w:iCs/>
+          <w:color w:val="555555"/>
+          <w:sz w:val="20"/>
+          <w:szCs w:val="20"/>
+        </w:rPr>
+        <w:t xml:space="preserve">REFS — Window spec (authoritative): LIVING_WINDOWS_ROADMAP.md §Ph 0–2.5 (SHOP / BAY / SLIT / ALCOVE / COMMERCIAL + corner bitmask; ARROWSLIT, MURDERHOLE). Upcoming window work: §Ph 6 EmojiMount port (retires zBypassMode), §Ph 7 surface-mount tiles (COUNTER, COFFEE_TABLE), §Ph 12 Proxy Zones (see PROXY_ZONE_DESIGN.md). Vignette authoring: engine/building-registry.js defaultVignette · engine/window-vignette.js. Mullion + frame textures: TEXTURE_ROADMAP.md §Layer 1. Weather-driven window reads: WEATHER_MODULE_ROADMAP.md §Planning (post-jam).</w:t>
       </w:r>
     </w:p>
     <w:p>
@@ -5258,6 +5378,26 @@
     </w:p>
     <w:p>
       <w:pPr>
+        <w:pBdr>
+          <w:left w:val="single" w:color="888888" w:sz="6" w:space="6"/>
+        </w:pBdr>
+        <w:spacing w:after="200"/>
+        <w:ind w:left="120"/>
+      </w:pPr>
+      <w:r>
+        <w:rPr>
+          <w:rFonts w:ascii="Arial" w:cs="Arial" w:eastAsia="Arial" w:hAnsi="Arial"/>
+          <w:i/>
+          <w:iCs/>
+          <w:color w:val="555555"/>
+          <w:sz w:val="20"/>
+          <w:szCs w:val="20"/>
+        </w:rPr>
+        <w:t xml:space="preserve">REFS — Prerequisite (RUN FIRST): LIVING_INFRASTRUCTURE_BLOCKOUT.md §5 Floor 1 · §6 Floor 2 · §7 Floor 3 — buildings and verb-nodes must be placed before refresh. Verb-node tiles (40–48): tiles.js + LIVING_INFRASTRUCTURE_BLOCKOUT.md §4 tile catalog; drop inside each refreshed interior. Minigame tile placement (WELL, ANVIL, SOUP_KITCHEN, BARREL, FUNGAL_PATCH, etc.): MINIGAME_TILES.md — pick Tier 1 tiles per building function; reconcile with LIVING_INFRA §4 so same tile has same treatment. Interior dressing: COZY_INTERIORS_DESIGN.md. Per-floor blockout gaps: BLOCKOUT_ALIGNMENT.md · FLOOR2_BLOCKOUT_PREP.md (Floor 2 critical) · floor3-crosshair-blockout.md (Floor 3). Dungeon-side gates + boss placement: DEPTH3_CLEANING_LOOP_BALANCE.md · D3_AI_LIVING_INFRA_PROCGEN_AUDIT_ROADMAP.md §12.6 creature-tile rules.</w:t>
+      </w:r>
+    </w:p>
+    <w:p>
+      <w:pPr>
         <w:spacing w:after="160"/>
       </w:pPr>
       <w:r>
@@ -5743,6 +5883,26 @@
           <w:szCs w:val="32"/>
         </w:rPr>
         <w:t xml:space="preserve">8. Implementation Sequence</w:t>
+      </w:r>
+    </w:p>
+    <w:p>
+      <w:pPr>
+        <w:pBdr>
+          <w:left w:val="single" w:color="888888" w:sz="6" w:space="6"/>
+        </w:pBdr>
+        <w:spacing w:after="200"/>
+        <w:ind w:left="120"/>
+      </w:pPr>
+      <w:r>
+        <w:rPr>
+          <w:rFonts w:ascii="Arial" w:cs="Arial" w:eastAsia="Arial" w:hAnsi="Arial"/>
+          <w:i/>
+          <w:iCs/>
+          <w:color w:val="555555"/>
+          <w:sz w:val="20"/>
+          <w:szCs w:val="20"/>
+        </w:rPr>
+        <w:t xml:space="preserve">REFS — Phase A (done): engine/texture-atlas.js · TEXTURE_ROADMAP.md. Phase B–C (registry + stamp-out): engine/building-registry.js · engine/floor-manager.js (doorFaces / doorTargets) · engine/door-sprites.js setTexture/setExteriorFace · DOOR_ARCHITECTURE_ROADMAP.md §Ph 3. Phase D (porthole recess): DOOR_ARCHITECTURE_ROADMAP.md §Ph 1.5 + RAYCAST_FREEFORM_UPGRADE_ROADMAP.md. Phase E (boss door): DOOR_ARCHITECTURE_ROADMAP.md §Ph 6A · engine/door-animator.js. Phase F (floor rebuild): LIVING_INFRASTRUCTURE_BLOCKOUT.md §6–7 · COZY_INTERIORS_DESIGN.md. Ship gates: TEST_HARNESS_ROADMAP.md (DebugPerfMonitor floor-entry capture) · PLAYTEST_AND_BLOCKOUT_PROCEDURE.md · DEBUG_NOTES_SCREENER.md (living log). Code-level navigation: run `python -m code_review_graph build` then use the code-review-graph MCP (detect_changes, get_impact_radius, query_graph callers_of) — see CLAUDE.md §MCP Tools.</w:t>
       </w:r>
     </w:p>
     <w:p>
@@ -6528,6 +6688,1238 @@
                 <w:szCs w:val="20"/>
               </w:rPr>
               <w:t xml:space="preserve">NEW. Tiers 1–5 shipped (freeform rebalance, see-through cavity, ladder sprite, hatch lid, direction-aware tint). Tiers 6–8 specced (pedestal mask, biome variants, animation).</w:t>
+            </w:r>
+          </w:p>
+        </w:tc>
+      </w:tr>
+      <w:tr>
+        <w:tc>
+          <w:tcPr>
+            <w:tcW w:type="dxa" w:w="3800"/>
+            <w:tcBorders>
+              <w:top w:val="single" w:color="CCCCCC" w:sz="1"/>
+              <w:left w:val="single" w:color="CCCCCC" w:sz="1"/>
+              <w:bottom w:val="single" w:color="CCCCCC" w:sz="1"/>
+              <w:right w:val="single" w:color="CCCCCC" w:sz="1"/>
+            </w:tcBorders>
+            <w:tcMar>
+              <w:top w:type="dxa" w:w="80"/>
+              <w:left w:type="dxa" w:w="120"/>
+              <w:bottom w:type="dxa" w:w="80"/>
+              <w:right w:type="dxa" w:w="120"/>
+            </w:tcMar>
+          </w:tcPr>
+          <w:p>
+            <w:r>
+              <w:rPr>
+                <w:rFonts w:ascii="Arial" w:cs="Arial" w:eastAsia="Arial" w:hAnsi="Arial"/>
+                <w:sz w:val="20"/>
+                <w:szCs w:val="20"/>
+              </w:rPr>
+              <w:t xml:space="preserve">LIVING_INFRASTRUCTURE_BLOCKOUT.md</w:t>
+            </w:r>
+          </w:p>
+        </w:tc>
+        <w:tc>
+          <w:tcPr>
+            <w:tcW w:type="dxa" w:w="5560"/>
+            <w:tcBorders>
+              <w:top w:val="single" w:color="CCCCCC" w:sz="1"/>
+              <w:left w:val="single" w:color="CCCCCC" w:sz="1"/>
+              <w:bottom w:val="single" w:color="CCCCCC" w:sz="1"/>
+              <w:right w:val="single" w:color="CCCCCC" w:sz="1"/>
+            </w:tcBorders>
+            <w:tcMar>
+              <w:top w:type="dxa" w:w="80"/>
+              <w:left w:type="dxa" w:w="120"/>
+              <w:bottom w:type="dxa" w:w="80"/>
+              <w:right w:type="dxa" w:w="120"/>
+            </w:tcMar>
+          </w:tcPr>
+          <w:p>
+            <w:r>
+              <w:rPr>
+                <w:rFonts w:ascii="Arial" w:cs="Arial" w:eastAsia="Arial" w:hAnsi="Arial"/>
+                <w:sz w:val="20"/>
+                <w:szCs w:val="20"/>
+              </w:rPr>
+              <w:t xml:space="preserve">PREREQUISITE. §4 tile catalog (40–48) + §5–7 floor-by-floor verb-node placement. Run before §7 refresh.</w:t>
+            </w:r>
+          </w:p>
+        </w:tc>
+      </w:tr>
+      <w:tr>
+        <w:tc>
+          <w:tcPr>
+            <w:tcW w:type="dxa" w:w="3800"/>
+            <w:tcBorders>
+              <w:top w:val="single" w:color="CCCCCC" w:sz="1"/>
+              <w:left w:val="single" w:color="CCCCCC" w:sz="1"/>
+              <w:bottom w:val="single" w:color="CCCCCC" w:sz="1"/>
+              <w:right w:val="single" w:color="CCCCCC" w:sz="1"/>
+            </w:tcBorders>
+            <w:tcMar>
+              <w:top w:type="dxa" w:w="80"/>
+              <w:left w:type="dxa" w:w="120"/>
+              <w:bottom w:type="dxa" w:w="80"/>
+              <w:right w:type="dxa" w:w="120"/>
+            </w:tcMar>
+          </w:tcPr>
+          <w:p>
+            <w:r>
+              <w:rPr>
+                <w:rFonts w:ascii="Arial" w:cs="Arial" w:eastAsia="Arial" w:hAnsi="Arial"/>
+                <w:sz w:val="20"/>
+                <w:szCs w:val="20"/>
+              </w:rPr>
+              <w:t xml:space="preserve">MINIGAME_TILES.md</w:t>
+            </w:r>
+          </w:p>
+        </w:tc>
+        <w:tc>
+          <w:tcPr>
+            <w:tcW w:type="dxa" w:w="5560"/>
+            <w:tcBorders>
+              <w:top w:val="single" w:color="CCCCCC" w:sz="1"/>
+              <w:left w:val="single" w:color="CCCCCC" w:sz="1"/>
+              <w:bottom w:val="single" w:color="CCCCCC" w:sz="1"/>
+              <w:right w:val="single" w:color="CCCCCC" w:sz="1"/>
+            </w:tcBorders>
+            <w:tcMar>
+              <w:top w:type="dxa" w:w="80"/>
+              <w:left w:type="dxa" w:w="120"/>
+              <w:bottom w:type="dxa" w:w="80"/>
+              <w:right w:type="dxa" w:w="120"/>
+            </w:tcMar>
+          </w:tcPr>
+          <w:p>
+            <w:r>
+              <w:rPr>
+                <w:rFonts w:ascii="Arial" w:cs="Arial" w:eastAsia="Arial" w:hAnsi="Arial"/>
+                <w:sz w:val="20"/>
+                <w:szCs w:val="20"/>
+              </w:rPr>
+              <w:t xml:space="preserve">Tile-by-tile clicky minigame designs. Tier 1 (WELL, ANVIL, SOUP_KITCHEN, BARREL, FUNGAL_PATCH) ready to drop inside refreshed buildings. Reconcile same-tile treatment with LIVING_INFRA §4.</w:t>
+            </w:r>
+          </w:p>
+        </w:tc>
+      </w:tr>
+      <w:tr>
+        <w:tc>
+          <w:tcPr>
+            <w:tcW w:type="dxa" w:w="3800"/>
+            <w:tcBorders>
+              <w:top w:val="single" w:color="CCCCCC" w:sz="1"/>
+              <w:left w:val="single" w:color="CCCCCC" w:sz="1"/>
+              <w:bottom w:val="single" w:color="CCCCCC" w:sz="1"/>
+              <w:right w:val="single" w:color="CCCCCC" w:sz="1"/>
+            </w:tcBorders>
+            <w:tcMar>
+              <w:top w:type="dxa" w:w="80"/>
+              <w:left w:type="dxa" w:w="120"/>
+              <w:bottom w:type="dxa" w:w="80"/>
+              <w:right w:type="dxa" w:w="120"/>
+            </w:tcMar>
+          </w:tcPr>
+          <w:p>
+            <w:r>
+              <w:rPr>
+                <w:rFonts w:ascii="Arial" w:cs="Arial" w:eastAsia="Arial" w:hAnsi="Arial"/>
+                <w:sz w:val="20"/>
+                <w:szCs w:val="20"/>
+              </w:rPr>
+              <w:t xml:space="preserve">ACT2_NARRATIVE_OUTLINE.md</w:t>
+            </w:r>
+          </w:p>
+        </w:tc>
+        <w:tc>
+          <w:tcPr>
+            <w:tcW w:type="dxa" w:w="5560"/>
+            <w:tcBorders>
+              <w:top w:val="single" w:color="CCCCCC" w:sz="1"/>
+              <w:left w:val="single" w:color="CCCCCC" w:sz="1"/>
+              <w:bottom w:val="single" w:color="CCCCCC" w:sz="1"/>
+              <w:right w:val="single" w:color="CCCCCC" w:sz="1"/>
+            </w:tcBorders>
+            <w:tcMar>
+              <w:top w:type="dxa" w:w="80"/>
+              <w:left w:type="dxa" w:w="120"/>
+              <w:bottom w:type="dxa" w:w="80"/>
+              <w:right w:type="dxa" w:w="120"/>
+            </w:tcMar>
+          </w:tcPr>
+          <w:p>
+            <w:r>
+              <w:rPr>
+                <w:rFonts w:ascii="Arial" w:cs="Arial" w:eastAsia="Arial" w:hAnsi="Arial"/>
+                <w:sz w:val="20"/>
+                <w:szCs w:val="20"/>
+              </w:rPr>
+              <w:t xml:space="preserve">§4 faction contacts drive faction-HQ boss doors. §5.4 housing reassignment changes Gleaner’s Home facade. §8 Ph 4 climax in Seaway 0.1.2 — boss door candidate.</w:t>
+            </w:r>
+          </w:p>
+        </w:tc>
+      </w:tr>
+      <w:tr>
+        <w:tc>
+          <w:tcPr>
+            <w:tcW w:type="dxa" w:w="3800"/>
+            <w:tcBorders>
+              <w:top w:val="single" w:color="CCCCCC" w:sz="1"/>
+              <w:left w:val="single" w:color="CCCCCC" w:sz="1"/>
+              <w:bottom w:val="single" w:color="CCCCCC" w:sz="1"/>
+              <w:right w:val="single" w:color="CCCCCC" w:sz="1"/>
+            </w:tcBorders>
+            <w:tcMar>
+              <w:top w:type="dxa" w:w="80"/>
+              <w:left w:type="dxa" w:w="120"/>
+              <w:bottom w:type="dxa" w:w="80"/>
+              <w:right w:type="dxa" w:w="120"/>
+            </w:tcMar>
+          </w:tcPr>
+          <w:p>
+            <w:r>
+              <w:rPr>
+                <w:rFonts w:ascii="Arial" w:cs="Arial" w:eastAsia="Arial" w:hAnsi="Arial"/>
+                <w:sz w:val="20"/>
+                <w:szCs w:val="20"/>
+              </w:rPr>
+              <w:t xml:space="preserve">STREET_CHRONICLES_NARRATIVE_OUTLINE.md</w:t>
+            </w:r>
+          </w:p>
+        </w:tc>
+        <w:tc>
+          <w:tcPr>
+            <w:tcW w:type="dxa" w:w="5560"/>
+            <w:tcBorders>
+              <w:top w:val="single" w:color="CCCCCC" w:sz="1"/>
+              <w:left w:val="single" w:color="CCCCCC" w:sz="1"/>
+              <w:bottom w:val="single" w:color="CCCCCC" w:sz="1"/>
+              <w:right w:val="single" w:color="CCCCCC" w:sz="1"/>
+            </w:tcBorders>
+            <w:tcMar>
+              <w:top w:type="dxa" w:w="80"/>
+              <w:left w:type="dxa" w:w="120"/>
+              <w:bottom w:type="dxa" w:w="80"/>
+              <w:right w:type="dxa" w:w="120"/>
+            </w:tcMar>
+          </w:tcPr>
+          <w:p>
+            <w:r>
+              <w:rPr>
+                <w:rFonts w:ascii="Arial" w:cs="Arial" w:eastAsia="Arial" w:hAnsi="Arial"/>
+                <w:sz w:val="20"/>
+                <w:szCs w:val="20"/>
+              </w:rPr>
+              <w:t xml:space="preserve">Act 1 faction home buildings (Coral Bazaar, Driftwood Inn, Dispatcher’s Office, Watchman’s Post). Pairs with §3 building audit.</w:t>
+            </w:r>
+          </w:p>
+        </w:tc>
+      </w:tr>
+      <w:tr>
+        <w:tc>
+          <w:tcPr>
+            <w:tcW w:type="dxa" w:w="3800"/>
+            <w:tcBorders>
+              <w:top w:val="single" w:color="CCCCCC" w:sz="1"/>
+              <w:left w:val="single" w:color="CCCCCC" w:sz="1"/>
+              <w:bottom w:val="single" w:color="CCCCCC" w:sz="1"/>
+              <w:right w:val="single" w:color="CCCCCC" w:sz="1"/>
+            </w:tcBorders>
+            <w:tcMar>
+              <w:top w:type="dxa" w:w="80"/>
+              <w:left w:type="dxa" w:w="120"/>
+              <w:bottom w:type="dxa" w:w="80"/>
+              <w:right w:type="dxa" w:w="120"/>
+            </w:tcMar>
+          </w:tcPr>
+          <w:p>
+            <w:r>
+              <w:rPr>
+                <w:rFonts w:ascii="Arial" w:cs="Arial" w:eastAsia="Arial" w:hAnsi="Arial"/>
+                <w:sz w:val="20"/>
+                <w:szCs w:val="20"/>
+              </w:rPr>
+              <w:t xml:space="preserve">HERO_FOYER_ENCOUNTER.md</w:t>
+            </w:r>
+          </w:p>
+        </w:tc>
+        <w:tc>
+          <w:tcPr>
+            <w:tcW w:type="dxa" w:w="5560"/>
+            <w:tcBorders>
+              <w:top w:val="single" w:color="CCCCCC" w:sz="1"/>
+              <w:left w:val="single" w:color="CCCCCC" w:sz="1"/>
+              <w:bottom w:val="single" w:color="CCCCCC" w:sz="1"/>
+              <w:right w:val="single" w:color="CCCCCC" w:sz="1"/>
+            </w:tcBorders>
+            <w:tcMar>
+              <w:top w:type="dxa" w:w="80"/>
+              <w:left w:type="dxa" w:w="120"/>
+              <w:bottom w:type="dxa" w:w="80"/>
+              <w:right w:type="dxa" w:w="120"/>
+            </w:tcMar>
+          </w:tcPr>
+          <w:p>
+            <w:r>
+              <w:rPr>
+                <w:rFonts w:ascii="Arial" w:cs="Arial" w:eastAsia="Arial" w:hAnsi="Arial"/>
+                <w:sz w:val="20"/>
+                <w:szCs w:val="20"/>
+              </w:rPr>
+              <w:t xml:space="preserve">Hero’s Wake B2 (2.2.2) — primary Act 1 boss door candidate. Placement + locked-gate semantics.</w:t>
+            </w:r>
+          </w:p>
+        </w:tc>
+      </w:tr>
+      <w:tr>
+        <w:tc>
+          <w:tcPr>
+            <w:tcW w:type="dxa" w:w="3800"/>
+            <w:tcBorders>
+              <w:top w:val="single" w:color="CCCCCC" w:sz="1"/>
+              <w:left w:val="single" w:color="CCCCCC" w:sz="1"/>
+              <w:bottom w:val="single" w:color="CCCCCC" w:sz="1"/>
+              <w:right w:val="single" w:color="CCCCCC" w:sz="1"/>
+            </w:tcBorders>
+            <w:tcMar>
+              <w:top w:type="dxa" w:w="80"/>
+              <w:left w:type="dxa" w:w="120"/>
+              <w:bottom w:type="dxa" w:w="80"/>
+              <w:right w:type="dxa" w:w="120"/>
+            </w:tcMar>
+          </w:tcPr>
+          <w:p>
+            <w:r>
+              <w:rPr>
+                <w:rFonts w:ascii="Arial" w:cs="Arial" w:eastAsia="Arial" w:hAnsi="Arial"/>
+                <w:sz w:val="20"/>
+                <w:szCs w:val="20"/>
+              </w:rPr>
+              <w:t xml:space="preserve">COZY_INTERIORS_DESIGN.md</w:t>
+            </w:r>
+          </w:p>
+        </w:tc>
+        <w:tc>
+          <w:tcPr>
+            <w:tcW w:type="dxa" w:w="5560"/>
+            <w:tcBorders>
+              <w:top w:val="single" w:color="CCCCCC" w:sz="1"/>
+              <w:left w:val="single" w:color="CCCCCC" w:sz="1"/>
+              <w:bottom w:val="single" w:color="CCCCCC" w:sz="1"/>
+              <w:right w:val="single" w:color="CCCCCC" w:sz="1"/>
+            </w:tcBorders>
+            <w:tcMar>
+              <w:top w:type="dxa" w:w="80"/>
+              <w:left w:type="dxa" w:w="120"/>
+              <w:bottom w:type="dxa" w:w="80"/>
+              <w:right w:type="dxa" w:w="120"/>
+            </w:tcMar>
+          </w:tcPr>
+          <w:p>
+            <w:r>
+              <w:rPr>
+                <w:rFonts w:ascii="Arial" w:cs="Arial" w:eastAsia="Arial" w:hAnsi="Arial"/>
+                <w:sz w:val="20"/>
+                <w:szCs w:val="20"/>
+              </w:rPr>
+              <w:t xml:space="preserve">Interior dressing once facades are refreshed. Tile/furniture palette, NPC seating, warmth-vs-austere contrast.</w:t>
+            </w:r>
+          </w:p>
+        </w:tc>
+      </w:tr>
+      <w:tr>
+        <w:tc>
+          <w:tcPr>
+            <w:tcW w:type="dxa" w:w="3800"/>
+            <w:tcBorders>
+              <w:top w:val="single" w:color="CCCCCC" w:sz="1"/>
+              <w:left w:val="single" w:color="CCCCCC" w:sz="1"/>
+              <w:bottom w:val="single" w:color="CCCCCC" w:sz="1"/>
+              <w:right w:val="single" w:color="CCCCCC" w:sz="1"/>
+            </w:tcBorders>
+            <w:tcMar>
+              <w:top w:type="dxa" w:w="80"/>
+              <w:left w:type="dxa" w:w="120"/>
+              <w:bottom w:type="dxa" w:w="80"/>
+              <w:right w:type="dxa" w:w="120"/>
+            </w:tcMar>
+          </w:tcPr>
+          <w:p>
+            <w:r>
+              <w:rPr>
+                <w:rFonts w:ascii="Arial" w:cs="Arial" w:eastAsia="Arial" w:hAnsi="Arial"/>
+                <w:sz w:val="20"/>
+                <w:szCs w:val="20"/>
+              </w:rPr>
+              <w:t xml:space="preserve">Biome Plan.html</w:t>
+            </w:r>
+          </w:p>
+        </w:tc>
+        <w:tc>
+          <w:tcPr>
+            <w:tcW w:type="dxa" w:w="5560"/>
+            <w:tcBorders>
+              <w:top w:val="single" w:color="CCCCCC" w:sz="1"/>
+              <w:left w:val="single" w:color="CCCCCC" w:sz="1"/>
+              <w:bottom w:val="single" w:color="CCCCCC" w:sz="1"/>
+              <w:right w:val="single" w:color="CCCCCC" w:sz="1"/>
+            </w:tcBorders>
+            <w:tcMar>
+              <w:top w:type="dxa" w:w="80"/>
+              <w:left w:type="dxa" w:w="120"/>
+              <w:bottom w:type="dxa" w:w="80"/>
+              <w:right w:type="dxa" w:w="120"/>
+            </w:tcMar>
+          </w:tcPr>
+          <w:p>
+            <w:r>
+              <w:rPr>
+                <w:rFonts w:ascii="Arial" w:cs="Arial" w:eastAsia="Arial" w:hAnsi="Arial"/>
+                <w:sz w:val="20"/>
+                <w:szCs w:val="20"/>
+              </w:rPr>
+              <w:t xml:space="preserve">Canonical floor layouts + material palettes per biome. Reference before choosing wallTexture/doorSurround combos.</w:t>
+            </w:r>
+          </w:p>
+        </w:tc>
+      </w:tr>
+      <w:tr>
+        <w:tc>
+          <w:tcPr>
+            <w:tcW w:type="dxa" w:w="3800"/>
+            <w:tcBorders>
+              <w:top w:val="single" w:color="CCCCCC" w:sz="1"/>
+              <w:left w:val="single" w:color="CCCCCC" w:sz="1"/>
+              <w:bottom w:val="single" w:color="CCCCCC" w:sz="1"/>
+              <w:right w:val="single" w:color="CCCCCC" w:sz="1"/>
+            </w:tcBorders>
+            <w:tcMar>
+              <w:top w:type="dxa" w:w="80"/>
+              <w:left w:type="dxa" w:w="120"/>
+              <w:bottom w:type="dxa" w:w="80"/>
+              <w:right w:type="dxa" w:w="120"/>
+            </w:tcMar>
+          </w:tcPr>
+          <w:p>
+            <w:r>
+              <w:rPr>
+                <w:rFonts w:ascii="Arial" w:cs="Arial" w:eastAsia="Arial" w:hAnsi="Arial"/>
+                <w:sz w:val="20"/>
+                <w:szCs w:val="20"/>
+              </w:rPr>
+              <w:t xml:space="preserve">BLOCKOUT_ALIGNMENT.md</w:t>
+            </w:r>
+          </w:p>
+        </w:tc>
+        <w:tc>
+          <w:tcPr>
+            <w:tcW w:type="dxa" w:w="5560"/>
+            <w:tcBorders>
+              <w:top w:val="single" w:color="CCCCCC" w:sz="1"/>
+              <w:left w:val="single" w:color="CCCCCC" w:sz="1"/>
+              <w:bottom w:val="single" w:color="CCCCCC" w:sz="1"/>
+              <w:right w:val="single" w:color="CCCCCC" w:sz="1"/>
+            </w:tcBorders>
+            <w:tcMar>
+              <w:top w:type="dxa" w:w="80"/>
+              <w:left w:type="dxa" w:w="120"/>
+              <w:bottom w:type="dxa" w:w="80"/>
+              <w:right w:type="dxa" w:w="120"/>
+            </w:tcMar>
+          </w:tcPr>
+          <w:p>
+            <w:r>
+              <w:rPr>
+                <w:rFonts w:ascii="Arial" w:cs="Arial" w:eastAsia="Arial" w:hAnsi="Arial"/>
+                <w:sz w:val="20"/>
+                <w:szCs w:val="20"/>
+              </w:rPr>
+              <w:t xml:space="preserve">Floor-by-floor gap analysis. Identifies where current blockout diverges from Biome Plan — consult before Section 7 checklists.</w:t>
+            </w:r>
+          </w:p>
+        </w:tc>
+      </w:tr>
+      <w:tr>
+        <w:tc>
+          <w:tcPr>
+            <w:tcW w:type="dxa" w:w="3800"/>
+            <w:tcBorders>
+              <w:top w:val="single" w:color="CCCCCC" w:sz="1"/>
+              <w:left w:val="single" w:color="CCCCCC" w:sz="1"/>
+              <w:bottom w:val="single" w:color="CCCCCC" w:sz="1"/>
+              <w:right w:val="single" w:color="CCCCCC" w:sz="1"/>
+            </w:tcBorders>
+            <w:tcMar>
+              <w:top w:type="dxa" w:w="80"/>
+              <w:left w:type="dxa" w:w="120"/>
+              <w:bottom w:type="dxa" w:w="80"/>
+              <w:right w:type="dxa" w:w="120"/>
+            </w:tcMar>
+          </w:tcPr>
+          <w:p>
+            <w:r>
+              <w:rPr>
+                <w:rFonts w:ascii="Arial" w:cs="Arial" w:eastAsia="Arial" w:hAnsi="Arial"/>
+                <w:sz w:val="20"/>
+                <w:szCs w:val="20"/>
+              </w:rPr>
+              <w:t xml:space="preserve">FLOOR2_BLOCKOUT_PREP.md</w:t>
+            </w:r>
+          </w:p>
+        </w:tc>
+        <w:tc>
+          <w:tcPr>
+            <w:tcW w:type="dxa" w:w="5560"/>
+            <w:tcBorders>
+              <w:top w:val="single" w:color="CCCCCC" w:sz="1"/>
+              <w:left w:val="single" w:color="CCCCCC" w:sz="1"/>
+              <w:bottom w:val="single" w:color="CCCCCC" w:sz="1"/>
+              <w:right w:val="single" w:color="CCCCCC" w:sz="1"/>
+            </w:tcBorders>
+            <w:tcMar>
+              <w:top w:type="dxa" w:w="80"/>
+              <w:left w:type="dxa" w:w="120"/>
+              <w:bottom w:type="dxa" w:w="80"/>
+              <w:right w:type="dxa" w:w="120"/>
+            </w:tcMar>
+          </w:tcPr>
+          <w:p>
+            <w:r>
+              <w:rPr>
+                <w:rFonts w:ascii="Arial" w:cs="Arial" w:eastAsia="Arial" w:hAnsi="Arial"/>
+                <w:sz w:val="20"/>
+                <w:szCs w:val="20"/>
+              </w:rPr>
+              <w:t xml:space="preserve">Floor 2 is critical (24x16 → 48x32+ expansion). This doc scopes the rebuild that Section 7.3 depends on.</w:t>
+            </w:r>
+          </w:p>
+        </w:tc>
+      </w:tr>
+      <w:tr>
+        <w:tc>
+          <w:tcPr>
+            <w:tcW w:type="dxa" w:w="3800"/>
+            <w:tcBorders>
+              <w:top w:val="single" w:color="CCCCCC" w:sz="1"/>
+              <w:left w:val="single" w:color="CCCCCC" w:sz="1"/>
+              <w:bottom w:val="single" w:color="CCCCCC" w:sz="1"/>
+              <w:right w:val="single" w:color="CCCCCC" w:sz="1"/>
+            </w:tcBorders>
+            <w:tcMar>
+              <w:top w:type="dxa" w:w="80"/>
+              <w:left w:type="dxa" w:w="120"/>
+              <w:bottom w:type="dxa" w:w="80"/>
+              <w:right w:type="dxa" w:w="120"/>
+            </w:tcMar>
+          </w:tcPr>
+          <w:p>
+            <w:r>
+              <w:rPr>
+                <w:rFonts w:ascii="Arial" w:cs="Arial" w:eastAsia="Arial" w:hAnsi="Arial"/>
+                <w:sz w:val="20"/>
+                <w:szCs w:val="20"/>
+              </w:rPr>
+              <w:t xml:space="preserve">floor3-crosshair-blockout.md</w:t>
+            </w:r>
+          </w:p>
+        </w:tc>
+        <w:tc>
+          <w:tcPr>
+            <w:tcW w:type="dxa" w:w="5560"/>
+            <w:tcBorders>
+              <w:top w:val="single" w:color="CCCCCC" w:sz="1"/>
+              <w:left w:val="single" w:color="CCCCCC" w:sz="1"/>
+              <w:bottom w:val="single" w:color="CCCCCC" w:sz="1"/>
+              <w:right w:val="single" w:color="CCCCCC" w:sz="1"/>
+            </w:tcBorders>
+            <w:tcMar>
+              <w:top w:type="dxa" w:w="80"/>
+              <w:left w:type="dxa" w:w="120"/>
+              <w:bottom w:type="dxa" w:w="80"/>
+              <w:right w:type="dxa" w:w="120"/>
+            </w:tcMar>
+          </w:tcPr>
+          <w:p>
+            <w:r>
+              <w:rPr>
+                <w:rFonts w:ascii="Arial" w:cs="Arial" w:eastAsia="Arial" w:hAnsi="Arial"/>
+                <w:sz w:val="20"/>
+                <w:szCs w:val="20"/>
+              </w:rPr>
+              <w:t xml:space="preserve">Floor 3 (Frontier Gate) crosshair layout — reference for Section 7.4.</w:t>
+            </w:r>
+          </w:p>
+        </w:tc>
+      </w:tr>
+      <w:tr>
+        <w:tc>
+          <w:tcPr>
+            <w:tcW w:type="dxa" w:w="3800"/>
+            <w:tcBorders>
+              <w:top w:val="single" w:color="CCCCCC" w:sz="1"/>
+              <w:left w:val="single" w:color="CCCCCC" w:sz="1"/>
+              <w:bottom w:val="single" w:color="CCCCCC" w:sz="1"/>
+              <w:right w:val="single" w:color="CCCCCC" w:sz="1"/>
+            </w:tcBorders>
+            <w:tcMar>
+              <w:top w:type="dxa" w:w="80"/>
+              <w:left w:type="dxa" w:w="120"/>
+              <w:bottom w:type="dxa" w:w="80"/>
+              <w:right w:type="dxa" w:w="120"/>
+            </w:tcMar>
+          </w:tcPr>
+          <w:p>
+            <w:r>
+              <w:rPr>
+                <w:rFonts w:ascii="Arial" w:cs="Arial" w:eastAsia="Arial" w:hAnsi="Arial"/>
+                <w:sz w:val="20"/>
+                <w:szCs w:val="20"/>
+              </w:rPr>
+              <w:t xml:space="preserve">SPATIAL_CONTRACTS.md</w:t>
+            </w:r>
+          </w:p>
+        </w:tc>
+        <w:tc>
+          <w:tcPr>
+            <w:tcW w:type="dxa" w:w="5560"/>
+            <w:tcBorders>
+              <w:top w:val="single" w:color="CCCCCC" w:sz="1"/>
+              <w:left w:val="single" w:color="CCCCCC" w:sz="1"/>
+              <w:bottom w:val="single" w:color="CCCCCC" w:sz="1"/>
+              <w:right w:val="single" w:color="CCCCCC" w:sz="1"/>
+            </w:tcBorders>
+            <w:tcMar>
+              <w:top w:type="dxa" w:w="80"/>
+              <w:left w:type="dxa" w:w="120"/>
+              <w:bottom w:type="dxa" w:w="80"/>
+              <w:right w:type="dxa" w:w="120"/>
+            </w:tcMar>
+          </w:tcPr>
+          <w:p>
+            <w:r>
+              <w:rPr>
+                <w:rFonts w:ascii="Arial" w:cs="Arial" w:eastAsia="Arial" w:hAnsi="Arial"/>
+                <w:sz w:val="20"/>
+                <w:szCs w:val="20"/>
+              </w:rPr>
+              <w:t xml:space="preserve">tileFreeform / tileWallHeights / tileHeightOffsets / tileFloorTextures data model. All refresh config lands in these tables per spatial contract.</w:t>
+            </w:r>
+          </w:p>
+        </w:tc>
+      </w:tr>
+      <w:tr>
+        <w:tc>
+          <w:tcPr>
+            <w:tcW w:type="dxa" w:w="3800"/>
+            <w:tcBorders>
+              <w:top w:val="single" w:color="CCCCCC" w:sz="1"/>
+              <w:left w:val="single" w:color="CCCCCC" w:sz="1"/>
+              <w:bottom w:val="single" w:color="CCCCCC" w:sz="1"/>
+              <w:right w:val="single" w:color="CCCCCC" w:sz="1"/>
+            </w:tcBorders>
+            <w:tcMar>
+              <w:top w:type="dxa" w:w="80"/>
+              <w:left w:type="dxa" w:w="120"/>
+              <w:bottom w:type="dxa" w:w="80"/>
+              <w:right w:type="dxa" w:w="120"/>
+            </w:tcMar>
+          </w:tcPr>
+          <w:p>
+            <w:r>
+              <w:rPr>
+                <w:rFonts w:ascii="Arial" w:cs="Arial" w:eastAsia="Arial" w:hAnsi="Arial"/>
+                <w:sz w:val="20"/>
+                <w:szCs w:val="20"/>
+              </w:rPr>
+              <w:t xml:space="preserve">DEPTH3_CLEANING_LOOP_BALANCE.md</w:t>
+            </w:r>
+          </w:p>
+        </w:tc>
+        <w:tc>
+          <w:tcPr>
+            <w:tcW w:type="dxa" w:w="5560"/>
+            <w:tcBorders>
+              <w:top w:val="single" w:color="CCCCCC" w:sz="1"/>
+              <w:left w:val="single" w:color="CCCCCC" w:sz="1"/>
+              <w:bottom w:val="single" w:color="CCCCCC" w:sz="1"/>
+              <w:right w:val="single" w:color="CCCCCC" w:sz="1"/>
+            </w:tcBorders>
+            <w:tcMar>
+              <w:top w:type="dxa" w:w="80"/>
+              <w:left w:type="dxa" w:w="120"/>
+              <w:bottom w:type="dxa" w:w="80"/>
+              <w:right w:type="dxa" w:w="120"/>
+            </w:tcMar>
+          </w:tcPr>
+          <w:p>
+            <w:r>
+              <w:rPr>
+                <w:rFonts w:ascii="Arial" w:cs="Arial" w:eastAsia="Arial" w:hAnsi="Arial"/>
+                <w:sz w:val="20"/>
+                <w:szCs w:val="20"/>
+              </w:rPr>
+              <w:t xml:space="preserve">Dungeon-side gating + boss placement context. Boss doors leading INTO dungeons should satisfy these pacing constraints.</w:t>
+            </w:r>
+          </w:p>
+        </w:tc>
+      </w:tr>
+      <w:tr>
+        <w:tc>
+          <w:tcPr>
+            <w:tcW w:type="dxa" w:w="3800"/>
+            <w:tcBorders>
+              <w:top w:val="single" w:color="CCCCCC" w:sz="1"/>
+              <w:left w:val="single" w:color="CCCCCC" w:sz="1"/>
+              <w:bottom w:val="single" w:color="CCCCCC" w:sz="1"/>
+              <w:right w:val="single" w:color="CCCCCC" w:sz="1"/>
+            </w:tcBorders>
+            <w:tcMar>
+              <w:top w:type="dxa" w:w="80"/>
+              <w:left w:type="dxa" w:w="120"/>
+              <w:bottom w:type="dxa" w:w="80"/>
+              <w:right w:type="dxa" w:w="120"/>
+            </w:tcMar>
+          </w:tcPr>
+          <w:p>
+            <w:r>
+              <w:rPr>
+                <w:rFonts w:ascii="Arial" w:cs="Arial" w:eastAsia="Arial" w:hAnsi="Arial"/>
+                <w:sz w:val="20"/>
+                <w:szCs w:val="20"/>
+              </w:rPr>
+              <w:t xml:space="preserve">D3_AI_LIVING_INFRA_PROCGEN_AUDIT_ROADMAP.md</w:t>
+            </w:r>
+          </w:p>
+        </w:tc>
+        <w:tc>
+          <w:tcPr>
+            <w:tcW w:type="dxa" w:w="5560"/>
+            <w:tcBorders>
+              <w:top w:val="single" w:color="CCCCCC" w:sz="1"/>
+              <w:left w:val="single" w:color="CCCCCC" w:sz="1"/>
+              <w:bottom w:val="single" w:color="CCCCCC" w:sz="1"/>
+              <w:right w:val="single" w:color="CCCCCC" w:sz="1"/>
+            </w:tcBorders>
+            <w:tcMar>
+              <w:top w:type="dxa" w:w="80"/>
+              <w:left w:type="dxa" w:w="120"/>
+              <w:bottom w:type="dxa" w:w="80"/>
+              <w:right w:type="dxa" w:w="120"/>
+            </w:tcMar>
+          </w:tcPr>
+          <w:p>
+            <w:r>
+              <w:rPr>
+                <w:rFonts w:ascii="Arial" w:cs="Arial" w:eastAsia="Arial" w:hAnsi="Arial"/>
+                <w:sz w:val="20"/>
+                <w:szCs w:val="20"/>
+              </w:rPr>
+              <w:t xml:space="preserve">§12.6 creature-tile placement rules — feed into D3 proc-gen composer so dungeon creature economy comes online.</w:t>
+            </w:r>
+          </w:p>
+        </w:tc>
+      </w:tr>
+      <w:tr>
+        <w:tc>
+          <w:tcPr>
+            <w:tcW w:type="dxa" w:w="3800"/>
+            <w:tcBorders>
+              <w:top w:val="single" w:color="CCCCCC" w:sz="1"/>
+              <w:left w:val="single" w:color="CCCCCC" w:sz="1"/>
+              <w:bottom w:val="single" w:color="CCCCCC" w:sz="1"/>
+              <w:right w:val="single" w:color="CCCCCC" w:sz="1"/>
+            </w:tcBorders>
+            <w:tcMar>
+              <w:top w:type="dxa" w:w="80"/>
+              <w:left w:type="dxa" w:w="120"/>
+              <w:bottom w:type="dxa" w:w="80"/>
+              <w:right w:type="dxa" w:w="120"/>
+            </w:tcMar>
+          </w:tcPr>
+          <w:p>
+            <w:r>
+              <w:rPr>
+                <w:rFonts w:ascii="Arial" w:cs="Arial" w:eastAsia="Arial" w:hAnsi="Arial"/>
+                <w:sz w:val="20"/>
+                <w:szCs w:val="20"/>
+              </w:rPr>
+              <w:t xml:space="preserve">NPC_SYSTEM_ROADMAP.md</w:t>
+            </w:r>
+          </w:p>
+        </w:tc>
+        <w:tc>
+          <w:tcPr>
+            <w:tcW w:type="dxa" w:w="5560"/>
+            <w:tcBorders>
+              <w:top w:val="single" w:color="CCCCCC" w:sz="1"/>
+              <w:left w:val="single" w:color="CCCCCC" w:sz="1"/>
+              <w:bottom w:val="single" w:color="CCCCCC" w:sz="1"/>
+              <w:right w:val="single" w:color="CCCCCC" w:sz="1"/>
+            </w:tcBorders>
+            <w:tcMar>
+              <w:top w:type="dxa" w:w="80"/>
+              <w:left w:type="dxa" w:w="120"/>
+              <w:bottom w:type="dxa" w:w="80"/>
+              <w:right w:type="dxa" w:w="120"/>
+            </w:tcMar>
+          </w:tcPr>
+          <w:p>
+            <w:r>
+              <w:rPr>
+                <w:rFonts w:ascii="Arial" w:cs="Arial" w:eastAsia="Arial" w:hAnsi="Arial"/>
+                <w:sz w:val="20"/>
+                <w:szCs w:val="20"/>
+              </w:rPr>
+              <w:t xml:space="preserve">NPC occupancy + schedules inside refreshed buildings. Doors need to open for the right factions; rooms need seating + workstations.</w:t>
+            </w:r>
+          </w:p>
+        </w:tc>
+      </w:tr>
+      <w:tr>
+        <w:tc>
+          <w:tcPr>
+            <w:tcW w:type="dxa" w:w="3800"/>
+            <w:tcBorders>
+              <w:top w:val="single" w:color="CCCCCC" w:sz="1"/>
+              <w:left w:val="single" w:color="CCCCCC" w:sz="1"/>
+              <w:bottom w:val="single" w:color="CCCCCC" w:sz="1"/>
+              <w:right w:val="single" w:color="CCCCCC" w:sz="1"/>
+            </w:tcBorders>
+            <w:tcMar>
+              <w:top w:type="dxa" w:w="80"/>
+              <w:left w:type="dxa" w:w="120"/>
+              <w:bottom w:type="dxa" w:w="80"/>
+              <w:right w:type="dxa" w:w="120"/>
+            </w:tcMar>
+          </w:tcPr>
+          <w:p>
+            <w:r>
+              <w:rPr>
+                <w:rFonts w:ascii="Arial" w:cs="Arial" w:eastAsia="Arial" w:hAnsi="Arial"/>
+                <w:sz w:val="20"/>
+                <w:szCs w:val="20"/>
+              </w:rPr>
+              <w:t xml:space="preserve">NPC_FACTION_BOOK_AUDIT.md</w:t>
+            </w:r>
+          </w:p>
+        </w:tc>
+        <w:tc>
+          <w:tcPr>
+            <w:tcW w:type="dxa" w:w="5560"/>
+            <w:tcBorders>
+              <w:top w:val="single" w:color="CCCCCC" w:sz="1"/>
+              <w:left w:val="single" w:color="CCCCCC" w:sz="1"/>
+              <w:bottom w:val="single" w:color="CCCCCC" w:sz="1"/>
+              <w:right w:val="single" w:color="CCCCCC" w:sz="1"/>
+            </w:tcBorders>
+            <w:tcMar>
+              <w:top w:type="dxa" w:w="80"/>
+              <w:left w:type="dxa" w:w="120"/>
+              <w:bottom w:type="dxa" w:w="80"/>
+              <w:right w:type="dxa" w:w="120"/>
+            </w:tcMar>
+          </w:tcPr>
+          <w:p>
+            <w:r>
+              <w:rPr>
+                <w:rFonts w:ascii="Arial" w:cs="Arial" w:eastAsia="Arial" w:hAnsi="Arial"/>
+                <w:sz w:val="20"/>
+                <w:szCs w:val="20"/>
+              </w:rPr>
+              <w:t xml:space="preserve">Faction book → building crest mapping for boss door emblems.</w:t>
+            </w:r>
+          </w:p>
+        </w:tc>
+      </w:tr>
+      <w:tr>
+        <w:tc>
+          <w:tcPr>
+            <w:tcW w:type="dxa" w:w="3800"/>
+            <w:tcBorders>
+              <w:top w:val="single" w:color="CCCCCC" w:sz="1"/>
+              <w:left w:val="single" w:color="CCCCCC" w:sz="1"/>
+              <w:bottom w:val="single" w:color="CCCCCC" w:sz="1"/>
+              <w:right w:val="single" w:color="CCCCCC" w:sz="1"/>
+            </w:tcBorders>
+            <w:tcMar>
+              <w:top w:type="dxa" w:w="80"/>
+              <w:left w:type="dxa" w:w="120"/>
+              <w:bottom w:type="dxa" w:w="80"/>
+              <w:right w:type="dxa" w:w="120"/>
+            </w:tcMar>
+          </w:tcPr>
+          <w:p>
+            <w:r>
+              <w:rPr>
+                <w:rFonts w:ascii="Arial" w:cs="Arial" w:eastAsia="Arial" w:hAnsi="Arial"/>
+                <w:sz w:val="20"/>
+                <w:szCs w:val="20"/>
+              </w:rPr>
+              <w:t xml:space="preserve">PROXY_ZONE_DESIGN.md</w:t>
+            </w:r>
+          </w:p>
+        </w:tc>
+        <w:tc>
+          <w:tcPr>
+            <w:tcW w:type="dxa" w:w="5560"/>
+            <w:tcBorders>
+              <w:top w:val="single" w:color="CCCCCC" w:sz="1"/>
+              <w:left w:val="single" w:color="CCCCCC" w:sz="1"/>
+              <w:bottom w:val="single" w:color="CCCCCC" w:sz="1"/>
+              <w:right w:val="single" w:color="CCCCCC" w:sz="1"/>
+            </w:tcBorders>
+            <w:tcMar>
+              <w:top w:type="dxa" w:w="80"/>
+              <w:left w:type="dxa" w:w="120"/>
+              <w:bottom w:type="dxa" w:w="80"/>
+              <w:right w:type="dxa" w:w="120"/>
+            </w:tcMar>
+          </w:tcPr>
+          <w:p>
+            <w:r>
+              <w:rPr>
+                <w:rFonts w:ascii="Arial" w:cs="Arial" w:eastAsia="Arial" w:hAnsi="Arial"/>
+                <w:sz w:val="20"/>
+                <w:szCs w:val="20"/>
+              </w:rPr>
+              <w:t xml:space="preserve">Interior windows looking OUT onto pasted exterior slices (LIVING_WINDOWS Phase 12). Design-only — flag any interior refresh that might want a proxy zone.</w:t>
+            </w:r>
+          </w:p>
+        </w:tc>
+      </w:tr>
+      <w:tr>
+        <w:tc>
+          <w:tcPr>
+            <w:tcW w:type="dxa" w:w="3800"/>
+            <w:tcBorders>
+              <w:top w:val="single" w:color="CCCCCC" w:sz="1"/>
+              <w:left w:val="single" w:color="CCCCCC" w:sz="1"/>
+              <w:bottom w:val="single" w:color="CCCCCC" w:sz="1"/>
+              <w:right w:val="single" w:color="CCCCCC" w:sz="1"/>
+            </w:tcBorders>
+            <w:tcMar>
+              <w:top w:type="dxa" w:w="80"/>
+              <w:left w:type="dxa" w:w="120"/>
+              <w:bottom w:type="dxa" w:w="80"/>
+              <w:right w:type="dxa" w:w="120"/>
+            </w:tcMar>
+          </w:tcPr>
+          <w:p>
+            <w:r>
+              <w:rPr>
+                <w:rFonts w:ascii="Arial" w:cs="Arial" w:eastAsia="Arial" w:hAnsi="Arial"/>
+                <w:sz w:val="20"/>
+                <w:szCs w:val="20"/>
+              </w:rPr>
+              <w:t xml:space="preserve">WEATHER_MODULE_ROADMAP.md</w:t>
+            </w:r>
+          </w:p>
+        </w:tc>
+        <w:tc>
+          <w:tcPr>
+            <w:tcW w:type="dxa" w:w="5560"/>
+            <w:tcBorders>
+              <w:top w:val="single" w:color="CCCCCC" w:sz="1"/>
+              <w:left w:val="single" w:color="CCCCCC" w:sz="1"/>
+              <w:bottom w:val="single" w:color="CCCCCC" w:sz="1"/>
+              <w:right w:val="single" w:color="CCCCCC" w:sz="1"/>
+            </w:tcBorders>
+            <w:tcMar>
+              <w:top w:type="dxa" w:w="80"/>
+              <w:left w:type="dxa" w:w="120"/>
+              <w:bottom w:type="dxa" w:w="80"/>
+              <w:right w:type="dxa" w:w="120"/>
+            </w:tcMar>
+          </w:tcPr>
+          <w:p>
+            <w:r>
+              <w:rPr>
+                <w:rFonts w:ascii="Arial" w:cs="Arial" w:eastAsia="Arial" w:hAnsi="Arial"/>
+                <w:sz w:val="20"/>
+                <w:szCs w:val="20"/>
+              </w:rPr>
+              <w:t xml:space="preserve">Post-jam: per-floor weather overlays affecting window reads. Don’t block the refresh on this but keep facades weather-compatible.</w:t>
+            </w:r>
+          </w:p>
+        </w:tc>
+      </w:tr>
+      <w:tr>
+        <w:tc>
+          <w:tcPr>
+            <w:tcW w:type="dxa" w:w="3800"/>
+            <w:tcBorders>
+              <w:top w:val="single" w:color="CCCCCC" w:sz="1"/>
+              <w:left w:val="single" w:color="CCCCCC" w:sz="1"/>
+              <w:bottom w:val="single" w:color="CCCCCC" w:sz="1"/>
+              <w:right w:val="single" w:color="CCCCCC" w:sz="1"/>
+            </w:tcBorders>
+            <w:tcMar>
+              <w:top w:type="dxa" w:w="80"/>
+              <w:left w:type="dxa" w:w="120"/>
+              <w:bottom w:type="dxa" w:w="80"/>
+              <w:right w:type="dxa" w:w="120"/>
+            </w:tcMar>
+          </w:tcPr>
+          <w:p>
+            <w:r>
+              <w:rPr>
+                <w:rFonts w:ascii="Arial" w:cs="Arial" w:eastAsia="Arial" w:hAnsi="Arial"/>
+                <w:sz w:val="20"/>
+                <w:szCs w:val="20"/>
+              </w:rPr>
+              <w:t xml:space="preserve">TEST_HARNESS_ROADMAP.md</w:t>
+            </w:r>
+          </w:p>
+        </w:tc>
+        <w:tc>
+          <w:tcPr>
+            <w:tcW w:type="dxa" w:w="5560"/>
+            <w:tcBorders>
+              <w:top w:val="single" w:color="CCCCCC" w:sz="1"/>
+              <w:left w:val="single" w:color="CCCCCC" w:sz="1"/>
+              <w:bottom w:val="single" w:color="CCCCCC" w:sz="1"/>
+              <w:right w:val="single" w:color="CCCCCC" w:sz="1"/>
+            </w:tcBorders>
+            <w:tcMar>
+              <w:top w:type="dxa" w:w="80"/>
+              <w:left w:type="dxa" w:w="120"/>
+              <w:bottom w:type="dxa" w:w="80"/>
+              <w:right w:type="dxa" w:w="120"/>
+            </w:tcMar>
+          </w:tcPr>
+          <w:p>
+            <w:r>
+              <w:rPr>
+                <w:rFonts w:ascii="Arial" w:cs="Arial" w:eastAsia="Arial" w:hAnsi="Arial"/>
+                <w:sz w:val="20"/>
+                <w:szCs w:val="20"/>
+              </w:rPr>
+              <w:t xml:space="preserve">DebugPerfMonitor floor-entry capture — run before + after each floor refresh to catch perf regressions from added freeform tiles.</w:t>
+            </w:r>
+          </w:p>
+        </w:tc>
+      </w:tr>
+      <w:tr>
+        <w:tc>
+          <w:tcPr>
+            <w:tcW w:type="dxa" w:w="3800"/>
+            <w:tcBorders>
+              <w:top w:val="single" w:color="CCCCCC" w:sz="1"/>
+              <w:left w:val="single" w:color="CCCCCC" w:sz="1"/>
+              <w:bottom w:val="single" w:color="CCCCCC" w:sz="1"/>
+              <w:right w:val="single" w:color="CCCCCC" w:sz="1"/>
+            </w:tcBorders>
+            <w:tcMar>
+              <w:top w:type="dxa" w:w="80"/>
+              <w:left w:type="dxa" w:w="120"/>
+              <w:bottom w:type="dxa" w:w="80"/>
+              <w:right w:type="dxa" w:w="120"/>
+            </w:tcMar>
+          </w:tcPr>
+          <w:p>
+            <w:r>
+              <w:rPr>
+                <w:rFonts w:ascii="Arial" w:cs="Arial" w:eastAsia="Arial" w:hAnsi="Arial"/>
+                <w:sz w:val="20"/>
+                <w:szCs w:val="20"/>
+              </w:rPr>
+              <w:t xml:space="preserve">DEBUG_NOTES_SCREENER.md</w:t>
+            </w:r>
+          </w:p>
+        </w:tc>
+        <w:tc>
+          <w:tcPr>
+            <w:tcW w:type="dxa" w:w="5560"/>
+            <w:tcBorders>
+              <w:top w:val="single" w:color="CCCCCC" w:sz="1"/>
+              <w:left w:val="single" w:color="CCCCCC" w:sz="1"/>
+              <w:bottom w:val="single" w:color="CCCCCC" w:sz="1"/>
+              <w:right w:val="single" w:color="CCCCCC" w:sz="1"/>
+            </w:tcBorders>
+            <w:tcMar>
+              <w:top w:type="dxa" w:w="80"/>
+              <w:left w:type="dxa" w:w="120"/>
+              <w:bottom w:type="dxa" w:w="80"/>
+              <w:right w:type="dxa" w:w="120"/>
+            </w:tcMar>
+          </w:tcPr>
+          <w:p>
+            <w:r>
+              <w:rPr>
+                <w:rFonts w:ascii="Arial" w:cs="Arial" w:eastAsia="Arial" w:hAnsi="Arial"/>
+                <w:sz w:val="20"/>
+                <w:szCs w:val="20"/>
+              </w:rPr>
+              <w:t xml:space="preserve">Living debug log. Record anything odd during refresh here so the next engineer sees it.</w:t>
+            </w:r>
+          </w:p>
+        </w:tc>
+      </w:tr>
+      <w:tr>
+        <w:tc>
+          <w:tcPr>
+            <w:tcW w:type="dxa" w:w="3800"/>
+            <w:tcBorders>
+              <w:top w:val="single" w:color="CCCCCC" w:sz="1"/>
+              <w:left w:val="single" w:color="CCCCCC" w:sz="1"/>
+              <w:bottom w:val="single" w:color="CCCCCC" w:sz="1"/>
+              <w:right w:val="single" w:color="CCCCCC" w:sz="1"/>
+            </w:tcBorders>
+            <w:tcMar>
+              <w:top w:type="dxa" w:w="80"/>
+              <w:left w:type="dxa" w:w="120"/>
+              <w:bottom w:type="dxa" w:w="80"/>
+              <w:right w:type="dxa" w:w="120"/>
+            </w:tcMar>
+          </w:tcPr>
+          <w:p>
+            <w:r>
+              <w:rPr>
+                <w:rFonts w:ascii="Arial" w:cs="Arial" w:eastAsia="Arial" w:hAnsi="Arial"/>
+                <w:sz w:val="20"/>
+                <w:szCs w:val="20"/>
+              </w:rPr>
+              <w:t xml:space="preserve">PLAYTEST_AND_BLOCKOUT_PROCEDURE.md</w:t>
+            </w:r>
+          </w:p>
+        </w:tc>
+        <w:tc>
+          <w:tcPr>
+            <w:tcW w:type="dxa" w:w="5560"/>
+            <w:tcBorders>
+              <w:top w:val="single" w:color="CCCCCC" w:sz="1"/>
+              <w:left w:val="single" w:color="CCCCCC" w:sz="1"/>
+              <w:bottom w:val="single" w:color="CCCCCC" w:sz="1"/>
+              <w:right w:val="single" w:color="CCCCCC" w:sz="1"/>
+            </w:tcBorders>
+            <w:tcMar>
+              <w:top w:type="dxa" w:w="80"/>
+              <w:left w:type="dxa" w:w="120"/>
+              <w:bottom w:type="dxa" w:w="80"/>
+              <w:right w:type="dxa" w:w="120"/>
+            </w:tcMar>
+          </w:tcPr>
+          <w:p>
+            <w:r>
+              <w:rPr>
+                <w:rFonts w:ascii="Arial" w:cs="Arial" w:eastAsia="Arial" w:hAnsi="Arial"/>
+                <w:sz w:val="20"/>
+                <w:szCs w:val="20"/>
+              </w:rPr>
+              <w:t xml:space="preserve">Playtest cycle + tester guide — follow after each phase lands.</w:t>
+            </w:r>
+          </w:p>
+        </w:tc>
+      </w:tr>
+      <w:tr>
+        <w:tc>
+          <w:tcPr>
+            <w:tcW w:type="dxa" w:w="3800"/>
+            <w:tcBorders>
+              <w:top w:val="single" w:color="CCCCCC" w:sz="1"/>
+              <w:left w:val="single" w:color="CCCCCC" w:sz="1"/>
+              <w:bottom w:val="single" w:color="CCCCCC" w:sz="1"/>
+              <w:right w:val="single" w:color="CCCCCC" w:sz="1"/>
+            </w:tcBorders>
+            <w:tcMar>
+              <w:top w:type="dxa" w:w="80"/>
+              <w:left w:type="dxa" w:w="120"/>
+              <w:bottom w:type="dxa" w:w="80"/>
+              <w:right w:type="dxa" w:w="120"/>
+            </w:tcMar>
+          </w:tcPr>
+          <w:p>
+            <w:r>
+              <w:rPr>
+                <w:rFonts w:ascii="Arial" w:cs="Arial" w:eastAsia="Arial" w:hAnsi="Arial"/>
+                <w:sz w:val="20"/>
+                <w:szCs w:val="20"/>
+              </w:rPr>
+              <w:t xml:space="preserve">TABLE_OF_CONTENTS_CROSS_ROADMAP.md</w:t>
+            </w:r>
+          </w:p>
+        </w:tc>
+        <w:tc>
+          <w:tcPr>
+            <w:tcW w:type="dxa" w:w="5560"/>
+            <w:tcBorders>
+              <w:top w:val="single" w:color="CCCCCC" w:sz="1"/>
+              <w:left w:val="single" w:color="CCCCCC" w:sz="1"/>
+              <w:bottom w:val="single" w:color="CCCCCC" w:sz="1"/>
+              <w:right w:val="single" w:color="CCCCCC" w:sz="1"/>
+            </w:tcBorders>
+            <w:tcMar>
+              <w:top w:type="dxa" w:w="80"/>
+              <w:left w:type="dxa" w:w="120"/>
+              <w:bottom w:type="dxa" w:w="80"/>
+              <w:right w:type="dxa" w:w="120"/>
+            </w:tcMar>
+          </w:tcPr>
+          <w:p>
+            <w:r>
+              <w:rPr>
+                <w:rFonts w:ascii="Arial" w:cs="Arial" w:eastAsia="Arial" w:hAnsi="Arial"/>
+                <w:sz w:val="20"/>
+                <w:szCs w:val="20"/>
+              </w:rPr>
+              <w:t xml:space="preserve">Entry point for all docs. DOC-102 (this file) sits under the Current-arc block alongside DOC-103 NPC_REFRESH_PLAN (upcoming).</w:t>
+            </w:r>
+          </w:p>
+        </w:tc>
+      </w:tr>
+      <w:tr>
+        <w:tc>
+          <w:tcPr>
+            <w:tcW w:type="dxa" w:w="3800"/>
+            <w:tcBorders>
+              <w:top w:val="single" w:color="CCCCCC" w:sz="1"/>
+              <w:left w:val="single" w:color="CCCCCC" w:sz="1"/>
+              <w:bottom w:val="single" w:color="CCCCCC" w:sz="1"/>
+              <w:right w:val="single" w:color="CCCCCC" w:sz="1"/>
+            </w:tcBorders>
+            <w:tcMar>
+              <w:top w:type="dxa" w:w="80"/>
+              <w:left w:type="dxa" w:w="120"/>
+              <w:bottom w:type="dxa" w:w="80"/>
+              <w:right w:type="dxa" w:w="120"/>
+            </w:tcMar>
+          </w:tcPr>
+          <w:p>
+            <w:r>
+              <w:rPr>
+                <w:rFonts w:ascii="Arial" w:cs="Arial" w:eastAsia="Arial" w:hAnsi="Arial"/>
+                <w:sz w:val="20"/>
+                <w:szCs w:val="20"/>
+              </w:rPr>
+              <w:t xml:space="preserve">code-review-graph (MCP)</w:t>
+            </w:r>
+          </w:p>
+        </w:tc>
+        <w:tc>
+          <w:tcPr>
+            <w:tcW w:type="dxa" w:w="5560"/>
+            <w:tcBorders>
+              <w:top w:val="single" w:color="CCCCCC" w:sz="1"/>
+              <w:left w:val="single" w:color="CCCCCC" w:sz="1"/>
+              <w:bottom w:val="single" w:color="CCCCCC" w:sz="1"/>
+              <w:right w:val="single" w:color="CCCCCC" w:sz="1"/>
+            </w:tcBorders>
+            <w:tcMar>
+              <w:top w:type="dxa" w:w="80"/>
+              <w:left w:type="dxa" w:w="120"/>
+              <w:bottom w:type="dxa" w:w="80"/>
+              <w:right w:type="dxa" w:w="120"/>
+            </w:tcMar>
+          </w:tcPr>
+          <w:p>
+            <w:r>
+              <w:rPr>
+                <w:rFonts w:ascii="Arial" w:cs="Arial" w:eastAsia="Arial" w:hAnsi="Arial"/>
+                <w:sz w:val="20"/>
+                <w:szCs w:val="20"/>
+              </w:rPr>
+              <w:t xml:space="preserve">Not a doc — the project’s code knowledge graph. Use detect_changes, query_graph (callers_of / callees_of / imports_of / tests_for), get_impact_radius BEFORE opening code files. See CLAUDE.md §MCP Tools for usage.</w:t>
             </w:r>
           </w:p>
         </w:tc>

</xml_diff>